<commit_message>
Nolikumā vietnes adrese atkal esošā (github.io), kamēr jaunais domēns nestrādā
Co-Authored-By: Claude Sonnet 5.5 <noreply@anthropic.com>
</commit_message>
<xml_diff>
--- a/docs/Konkursa_nolikums.docx
+++ b/docs/Konkursa_nolikums.docx
@@ -215,15 +215,16 @@
         </w:rPr>
         <w:t xml:space="preserve">1.4. Konkursa norises vieta ir tīmekļa vietne </w:t>
       </w:r>
-      <w:r>
-        <w:rPr>
-          <w:rFonts w:ascii="Arial" w:hAnsi="Arial"/>
-          <w:b/>
-          <w:i w:val="0"/>
-          <w:sz w:val="22"/>
-        </w:rPr>
-        <w:t>inboxtalismans.lv</w:t>
-      </w:r>
+      <w:hyperlink r:id="rId9">
+        <w:r>
+          <w:rPr>
+            <w:color w:val="0563C1"/>
+            <w:u w:val="single"/>
+            <w:sz w:val="22"/>
+          </w:rPr>
+          <w:t>laura-marketingsinbox.github.io/konkurss-jauniesu</w:t>
+        </w:r>
+      </w:hyperlink>
       <w:r>
         <w:rPr>
           <w:rFonts w:ascii="Arial" w:hAnsi="Arial"/>
@@ -1131,7 +1132,7 @@
         </w:rPr>
         <w:t>8.7. Dalībnieks un/vai viņa likumiskais pārstāvis ir tiesīgs vērsties ar sūdzību Datu valsts inspekcijā (</w:t>
       </w:r>
-      <w:hyperlink r:id="rId9">
+      <w:hyperlink r:id="rId10">
         <w:r>
           <w:rPr>
             <w:color w:val="0563C1"/>
@@ -1161,7 +1162,7 @@
         </w:rPr>
         <w:t xml:space="preserve">8.8. Organizētāja pilna privātuma politika pieejama: </w:t>
       </w:r>
-      <w:hyperlink r:id="rId10">
+      <w:hyperlink r:id="rId11">
         <w:r>
           <w:rPr>
             <w:color w:val="0563C1"/>

</xml_diff>

<commit_message>
Noņem melnraksta un juridiskās dzeltenās piezīmes no nolikuma (LV/RU/EN, md, docx)
Co-Authored-By: Claude Sonnet 5.5 <noreply@anthropic.com>
</commit_message>
<xml_diff>
--- a/docs/Konkursa_nolikums.docx
+++ b/docs/Konkursa_nolikums.docx
@@ -8,59 +8,6 @@
       </w:pPr>
       <w:r>
         <w:t>"Radi nākamo Inbox.lv talismanu" - konkursa nolikums</w:t>
-      </w:r>
-    </w:p>
-    <w:p>
-      <w:pPr>
-        <w:shd w:val="clear" w:color="auto" w:fill="FFF3CD"/>
-        <w:pBdr>
-          <w:top w:val="single" w:sz="6" w:space="6" w:color="E0B23C"/>
-          <w:left w:val="single" w:sz="6" w:space="6" w:color="E0B23C"/>
-          <w:bottom w:val="single" w:sz="6" w:space="6" w:color="E0B23C"/>
-          <w:right w:val="single" w:sz="6" w:space="6" w:color="E0B23C"/>
-        </w:pBdr>
-        <w:spacing w:before="200" w:after="200"/>
-        <w:ind w:left="170" w:right="170"/>
-      </w:pPr>
-      <w:r>
-        <w:rPr>
-          <w:rFonts w:ascii="Arial" w:hAnsi="Arial"/>
-          <w:b/>
-          <w:color w:val="6B5410"/>
-          <w:sz w:val="21"/>
-        </w:rPr>
-        <w:t>⚠️ Melnraksts - nav juridiski apstiprināts</w:t>
-        <w:br/>
-      </w:r>
-      <w:r>
-        <w:rPr>
-          <w:rFonts w:ascii="Arial" w:hAnsi="Arial"/>
-          <w:b w:val="0"/>
-          <w:i w:val="0"/>
-          <w:color w:val="6B5410"/>
-          <w:sz w:val="20"/>
-        </w:rPr>
-        <w:t xml:space="preserve">Šis teksts sagatavots, balstoties uz Civillikumu, Autortiesību likumu, Vispārīgo datu aizsardzības regulu (GDPR) un reāliem Latvijas konkursu nolikumu piemēriem (t.sk. Datu valsts inspekcijas paša jauniešu konkursa nolikumu). Vietas ar </w:t>
-      </w:r>
-      <w:r>
-        <w:rPr>
-          <w:rFonts w:ascii="Arial" w:hAnsi="Arial"/>
-          <w:b/>
-          <w:i w:val="0"/>
-          <w:color w:val="CC0717"/>
-          <w:sz w:val="20"/>
-        </w:rPr>
-        <w:t>[...]</w:t>
-      </w:r>
-      <w:r>
-        <w:rPr>
-          <w:rFonts w:ascii="Arial" w:hAnsi="Arial"/>
-          <w:b w:val="0"/>
-          <w:i w:val="0"/>
-          <w:color w:val="6B5410"/>
-          <w:sz w:val="20"/>
-        </w:rPr>
-        <w:t xml:space="preserve"> vēl jāaizpilda ar konkrētiem datiem. Pirms konkursa reālas palaišanas dokuments jāapstiprina ar juristu — īpaši 7. un 8. sadaļa.</w:t>
       </w:r>
     </w:p>
     <w:p>
@@ -916,39 +863,6 @@
     </w:p>
     <w:p>
       <w:pPr>
-        <w:shd w:val="clear" w:color="auto" w:fill="FFF3CD"/>
-        <w:pBdr>
-          <w:top w:val="single" w:sz="6" w:space="6" w:color="E0B23C"/>
-          <w:left w:val="single" w:sz="6" w:space="6" w:color="E0B23C"/>
-          <w:bottom w:val="single" w:sz="6" w:space="6" w:color="E0B23C"/>
-          <w:right w:val="single" w:sz="6" w:space="6" w:color="E0B23C"/>
-        </w:pBdr>
-        <w:spacing w:before="200" w:after="200"/>
-        <w:ind w:left="170" w:right="170"/>
-      </w:pPr>
-      <w:r>
-        <w:rPr>
-          <w:rFonts w:ascii="Arial" w:hAnsi="Arial"/>
-          <w:b/>
-          <w:color w:val="6B5410"/>
-          <w:sz w:val="21"/>
-        </w:rPr>
-        <w:t>⚠️ Juridiska piezīme</w:t>
-        <w:br/>
-      </w:r>
-      <w:r>
-        <w:rPr>
-          <w:rFonts w:ascii="Arial" w:hAnsi="Arial"/>
-          <w:b w:val="0"/>
-          <w:i w:val="0"/>
-          <w:color w:val="6B5410"/>
-          <w:sz w:val="20"/>
-        </w:rPr>
-        <w:t>Šī sadaļa balstīta uz vispārīgiem Autortiesību likuma un Civillikuma principiem, bet pirms reālas palaišanas jāapstiprina ar juristu - īpaši attiecībā uz nepilngadīgo rīcībspēju un licences/tiesību nodošanas precīzu formulējumu.</w:t>
-      </w:r>
-    </w:p>
-    <w:p>
-      <w:pPr>
         <w:pStyle w:val="Heading2"/>
         <w:keepNext/>
         <w:spacing w:before="320"/>

</xml_diff>

<commit_message>
Noņem 8.6. punkta piezīmi par juristu un avotu rindiņu no nolikuma
Co-Authored-By: Claude Sonnet 5.5 <noreply@anthropic.com>
</commit_message>
<xml_diff>
--- a/docs/Konkursa_nolikums.docx
+++ b/docs/Konkursa_nolikums.docx
@@ -1033,7 +1033,7 @@
           <w:i/>
           <w:sz w:val="22"/>
         </w:rPr>
-        <w:t>(Ņemot vērā 7.3. punktu, uzvarētāja iesniegtā darba dzēšana pēc tiesību nodošanas var būt ierobežota - šis nosacījums jāformulē skaidri kopā ar juristu.)</w:t>
+        <w:t>(Ņemot vērā 7.3. punktu, uzvarētāja iesniegtā darba dzēšana pēc tiesību nodošanas var būt ierobežota.)</w:t>
       </w:r>
     </w:p>
     <w:p>
@@ -1155,21 +1155,6 @@
           <w:sz w:val="22"/>
         </w:rPr>
         <w:t>9.3. Šis nolikums sastādīts latviešu valodā un tulkots krievu un angļu valodā. Strīdu gadījumā noteicošā ir latviešu valodas versija.</w:t>
-      </w:r>
-    </w:p>
-    <w:p>
-      <w:pPr>
-        <w:spacing w:before="320"/>
-      </w:pPr>
-      <w:r>
-        <w:rPr>
-          <w:rFonts w:ascii="Arial" w:hAnsi="Arial"/>
-          <w:b w:val="0"/>
-          <w:i w:val="0"/>
-          <w:color w:val="8C8279"/>
-          <w:sz w:val="18"/>
-        </w:rPr>
-        <w:t>Sagatavots, izpētot: Civillikumu (219. pants - pilngadība), Autortiesību likumu (14. panta 5. daļa - morālās tiesības), Vispārīgo datu aizsardzības regulu, Reklāmas likumu, kā arī Datu valsts inspekcijas, Latvijas Republikas Patentu valdes un pašvaldību jauniešu konkursu nolikumu piemērus.</w:t>
       </w:r>
     </w:p>
     <w:sectPr>

</xml_diff>

<commit_message>
Kritiskie labojumi pēc analīzes: lapas nosaukums, Instagram atruna, uzvarētāja līgums un darba pārveidošana
- Cilnes nosaukums vairs nav "dizaina makets" (LV/RU/EN)
- Lapā "sociālajos tīklos" -> "Instagram"; Meta atruna nolikumā (5.3.) un zem balsošanas pogas
- 7.3.: tiesību nodošana ar rakstveida līgumu pirms balvas izsniegšanas (nepilngadīgajam arī vecāka paraksts) + uzvarētāja piekrišana darba pārveidošanai; 7.4. saskaņots
- Nolikums atjaunināts arī md un docx

Co-Authored-By: Claude Sonnet 5.5 <noreply@anthropic.com>
</commit_message>
<xml_diff>
--- a/docs/Konkursa_nolikums.docx
+++ b/docs/Konkursa_nolikums.docx
@@ -653,6 +653,17 @@
       </w:r>
     </w:p>
     <w:p>
+      <w:r>
+        <w:rPr>
+          <w:rFonts w:ascii="Arial" w:hAnsi="Arial"/>
+          <w:b w:val="0"/>
+          <w:i w:val="0"/>
+          <w:sz w:val="22"/>
+        </w:rPr>
+        <w:t>5.3. Šo konkursu nekādā veidā nesponsorē, neatbalsta un neadministrē Instagram, un tas nav ar to saistīts. Balsošanā piedalās Instagram lietotāji saskaņā ar Instagram lietošanas noteikumiem.</w:t>
+      </w:r>
+    </w:p>
+    <w:p>
       <w:pPr>
         <w:pStyle w:val="Heading2"/>
         <w:keepNext/>
@@ -827,7 +838,7 @@
           <w:i w:val="0"/>
           <w:sz w:val="22"/>
         </w:rPr>
-        <w:t>Konkursa uzvarētājs, saņemot balvu, nodod Organizētāja īpašumā visas ar iesniegto darbu saistītās izmantošanas (mantiskās) tiesības</w:t>
+        <w:t>Konkursa uzvarētājs, pirms balvas izsniegšanas parakstot rakstveida līgumu (nepilngadīgā gadījumā arī ar vecāka vai likumiskā aizbildņa parakstu), nodod Organizētāja īpašumā visas ar iesniegto darbu saistītās izmantošanas (mantiskās) tiesības</w:t>
       </w:r>
       <w:r>
         <w:rPr>
@@ -836,7 +847,7 @@
           <w:i w:val="0"/>
           <w:sz w:val="22"/>
         </w:rPr>
-        <w:t>, lai Organizētājs varētu iesniegto konceptu profesionāli tālāk attīstīt un brīvi izmantot kā oficiālu Inbox.lv zīmola tēlu jebkādā veidā un jebkuros kanālos, arī pēc Konkursa noslēguma, bez papildu atlīdzības, izņemot šajā nolikumā paredzēto balvu.</w:t>
+        <w:t>, lai Organizētājs varētu iesniegto konceptu profesionāli tālāk attīstīt un brīvi izmantot kā oficiālu Inbox.lv zīmola tēlu jebkādā veidā un jebkuros kanālos, arī pēc Konkursa noslēguma, bez papildu atlīdzības, izņemot šajā nolikumā paredzēto balvu. Uzvarētājs piekrīt, ka Organizētājs drīkst darbu pārveidot, papildināt un adaptēt, tostarp mainīt talismana vizuālo izskatu, vārdu un stāstu, un izmantot atvasinātos darbos.</w:t>
       </w:r>
     </w:p>
     <w:p>
@@ -847,7 +858,7 @@
           <w:i w:val="0"/>
           <w:sz w:val="22"/>
         </w:rPr>
-        <w:t>7.4. Autora personiskās (morālās) tiesības - tiesības uz autorību un darba integritāti -, kuras saskaņā ar Autortiesību likuma 14. panta piekto daļu nav atsavināmas, vienmēr paliek pie Dalībnieka/uzvarētāja neatkarīgi no 7.2. un 7.3. punktā minētās licences vai tiesību nodošanas.</w:t>
+        <w:t>7.4. Autora personiskās (morālās) tiesības - tiesības uz autorību un darba integritāti -, kuras saskaņā ar Autortiesību likuma 14. panta piekto daļu nav atsavināmas, vienmēr paliek pie Dalībnieka/uzvarētāja neatkarīgi no 7.2. un 7.3. punktā minētās licences vai tiesību nodošanas, ievērojot uzvarētāja piekrišanu darba pārveidošanai saskaņā ar 7.3. punktu.</w:t>
       </w:r>
     </w:p>
     <w:p>

</xml_diff>